<commit_message>
Versión final: Documento técnico revisado, corregido y aprobado.
</commit_message>
<xml_diff>
--- a/documento/Guia_Tecnica_LibreOffice.docx
+++ b/documento/Guia_Tecnica_LibreOffice.docx
@@ -163,11 +163,9 @@
       <w:pPr>
         <w:jc w:val="center"/>
       </w:pPr>
-      <w:proofErr w:type="spellStart"/>
       <w:r>
         <w:t>TecMD</w:t>
       </w:r>
-      <w:proofErr w:type="spellEnd"/>
     </w:p>
     <w:p>
       <w:pPr>
@@ -186,7 +184,14 @@
     <w:sdt>
       <w:sdtPr>
         <w:rPr>
-          <w:lang w:val="es-ES"/>
+          <w:rFonts w:eastAsiaTheme="minorHAnsi" w:cstheme="minorBidi"/>
+          <w:b w:val="0"/>
+          <w:color w:val="auto"/>
+          <w:kern w:val="2"/>
+          <w:sz w:val="24"/>
+          <w:szCs w:val="22"/>
+          <w:lang w:val="es-ES" w:eastAsia="en-US"/>
+          <w14:ligatures w14:val="standardContextual"/>
         </w:rPr>
         <w:id w:val="-1032416557"/>
         <w:docPartObj>
@@ -196,14 +201,7 @@
       </w:sdtPr>
       <w:sdtEndPr>
         <w:rPr>
-          <w:rFonts w:eastAsiaTheme="minorHAnsi" w:cstheme="minorBidi"/>
           <w:bCs/>
-          <w:color w:val="auto"/>
-          <w:kern w:val="2"/>
-          <w:sz w:val="24"/>
-          <w:szCs w:val="22"/>
-          <w:lang w:eastAsia="en-US"/>
-          <w14:ligatures w14:val="standardContextual"/>
         </w:rPr>
       </w:sdtEndPr>
       <w:sdtContent>
@@ -237,7 +235,7 @@
           <w:r>
             <w:fldChar w:fldCharType="separate"/>
           </w:r>
-          <w:hyperlink w:anchor="_Toc235715669" w:history="1">
+          <w:hyperlink w:anchor="_Toc235725844" w:history="1">
             <w:r>
               <w:rPr>
                 <w:rStyle w:val="Hipervnculo"/>
@@ -264,7 +262,7 @@
                 <w:noProof/>
                 <w:webHidden/>
               </w:rPr>
-              <w:instrText xml:space="preserve"> PAGEREF _Toc235715669 \h </w:instrText>
+              <w:instrText xml:space="preserve"> PAGEREF _Toc235725844 \h </w:instrText>
             </w:r>
             <w:r>
               <w:rPr>
@@ -305,7 +303,7 @@
               <w:lang w:eastAsia="es-CO"/>
             </w:rPr>
           </w:pPr>
-          <w:hyperlink w:anchor="_Toc235715670" w:history="1">
+          <w:hyperlink w:anchor="_Toc235725845" w:history="1">
             <w:r>
               <w:rPr>
                 <w:rStyle w:val="Hipervnculo"/>
@@ -332,7 +330,7 @@
                 <w:noProof/>
                 <w:webHidden/>
               </w:rPr>
-              <w:instrText xml:space="preserve"> PAGEREF _Toc235715670 \h </w:instrText>
+              <w:instrText xml:space="preserve"> PAGEREF _Toc235725845 \h </w:instrText>
             </w:r>
             <w:r>
               <w:rPr>
@@ -376,7 +374,7 @@
               <w:lang w:eastAsia="es-CO"/>
             </w:rPr>
           </w:pPr>
-          <w:hyperlink w:anchor="_Toc235715671" w:history="1">
+          <w:hyperlink w:anchor="_Toc235725846" w:history="1">
             <w:r>
               <w:rPr>
                 <w:rStyle w:val="Hipervnculo"/>
@@ -403,7 +401,7 @@
                 <w:noProof/>
                 <w:webHidden/>
               </w:rPr>
-              <w:instrText xml:space="preserve"> PAGEREF _Toc235715671 \h </w:instrText>
+              <w:instrText xml:space="preserve"> PAGEREF _Toc235725846 \h </w:instrText>
             </w:r>
             <w:r>
               <w:rPr>
@@ -447,7 +445,7 @@
               <w:lang w:eastAsia="es-CO"/>
             </w:rPr>
           </w:pPr>
-          <w:hyperlink w:anchor="_Toc235715672" w:history="1">
+          <w:hyperlink w:anchor="_Toc235725847" w:history="1">
             <w:r>
               <w:rPr>
                 <w:rStyle w:val="Hipervnculo"/>
@@ -474,7 +472,7 @@
                 <w:noProof/>
                 <w:webHidden/>
               </w:rPr>
-              <w:instrText xml:space="preserve"> PAGEREF _Toc235715672 \h </w:instrText>
+              <w:instrText xml:space="preserve"> PAGEREF _Toc235725847 \h </w:instrText>
             </w:r>
             <w:r>
               <w:rPr>
@@ -515,7 +513,7 @@
               <w:lang w:eastAsia="es-CO"/>
             </w:rPr>
           </w:pPr>
-          <w:hyperlink w:anchor="_Toc235715673" w:history="1">
+          <w:hyperlink w:anchor="_Toc235725848" w:history="1">
             <w:r>
               <w:rPr>
                 <w:rStyle w:val="Hipervnculo"/>
@@ -542,7 +540,7 @@
                 <w:noProof/>
                 <w:webHidden/>
               </w:rPr>
-              <w:instrText xml:space="preserve"> PAGEREF _Toc235715673 \h </w:instrText>
+              <w:instrText xml:space="preserve"> PAGEREF _Toc235725848 \h </w:instrText>
             </w:r>
             <w:r>
               <w:rPr>
@@ -586,7 +584,7 @@
               <w:lang w:eastAsia="es-CO"/>
             </w:rPr>
           </w:pPr>
-          <w:hyperlink w:anchor="_Toc235715674" w:history="1">
+          <w:hyperlink w:anchor="_Toc235725849" w:history="1">
             <w:r>
               <w:rPr>
                 <w:rStyle w:val="Hipervnculo"/>
@@ -613,7 +611,7 @@
                 <w:noProof/>
                 <w:webHidden/>
               </w:rPr>
-              <w:instrText xml:space="preserve"> PAGEREF _Toc235715674 \h </w:instrText>
+              <w:instrText xml:space="preserve"> PAGEREF _Toc235725849 \h </w:instrText>
             </w:r>
             <w:r>
               <w:rPr>
@@ -645,48 +643,1768 @@
           </w:hyperlink>
         </w:p>
         <w:p>
+          <w:pPr>
+            <w:pStyle w:val="TDC1"/>
+            <w:rPr>
+              <w:rFonts w:asciiTheme="minorHAnsi" w:eastAsiaTheme="minorEastAsia" w:hAnsiTheme="minorHAnsi"/>
+              <w:noProof/>
+              <w:szCs w:val="24"/>
+              <w:lang w:eastAsia="es-CO"/>
+            </w:rPr>
+          </w:pPr>
+          <w:hyperlink w:anchor="_Toc235725850" w:history="1">
+            <w:r>
+              <w:rPr>
+                <w:rStyle w:val="Hipervnculo"/>
+                <w:noProof/>
+              </w:rPr>
+              <w:t>Instalación</w:t>
+            </w:r>
+            <w:r>
+              <w:rPr>
+                <w:noProof/>
+                <w:webHidden/>
+              </w:rPr>
+              <w:tab/>
+            </w:r>
+            <w:r>
+              <w:rPr>
+                <w:noProof/>
+                <w:webHidden/>
+              </w:rPr>
+              <w:fldChar w:fldCharType="begin"/>
+            </w:r>
+            <w:r>
+              <w:rPr>
+                <w:noProof/>
+                <w:webHidden/>
+              </w:rPr>
+              <w:instrText xml:space="preserve"> PAGEREF _Toc235725850 \h </w:instrText>
+            </w:r>
+            <w:r>
+              <w:rPr>
+                <w:noProof/>
+                <w:webHidden/>
+              </w:rPr>
+            </w:r>
+            <w:r>
+              <w:rPr>
+                <w:noProof/>
+                <w:webHidden/>
+              </w:rPr>
+              <w:fldChar w:fldCharType="separate"/>
+            </w:r>
+            <w:r>
+              <w:rPr>
+                <w:noProof/>
+                <w:webHidden/>
+              </w:rPr>
+              <w:t>4</w:t>
+            </w:r>
+            <w:r>
+              <w:rPr>
+                <w:noProof/>
+                <w:webHidden/>
+              </w:rPr>
+              <w:fldChar w:fldCharType="end"/>
+            </w:r>
+          </w:hyperlink>
+        </w:p>
+        <w:p>
+          <w:pPr>
+            <w:pStyle w:val="TDC2"/>
+            <w:tabs>
+              <w:tab w:val="right" w:leader="dot" w:pos="9350"/>
+            </w:tabs>
+            <w:rPr>
+              <w:rFonts w:asciiTheme="minorHAnsi" w:eastAsiaTheme="minorEastAsia" w:hAnsiTheme="minorHAnsi"/>
+              <w:noProof/>
+              <w:szCs w:val="24"/>
+              <w:lang w:eastAsia="es-CO"/>
+            </w:rPr>
+          </w:pPr>
+          <w:hyperlink w:anchor="_Toc235725851" w:history="1">
+            <w:r>
+              <w:rPr>
+                <w:rStyle w:val="Hipervnculo"/>
+                <w:noProof/>
+              </w:rPr>
+              <w:t>Paso 1:</w:t>
+            </w:r>
+            <w:r>
+              <w:rPr>
+                <w:noProof/>
+                <w:webHidden/>
+              </w:rPr>
+              <w:tab/>
+            </w:r>
+            <w:r>
+              <w:rPr>
+                <w:noProof/>
+                <w:webHidden/>
+              </w:rPr>
+              <w:fldChar w:fldCharType="begin"/>
+            </w:r>
+            <w:r>
+              <w:rPr>
+                <w:noProof/>
+                <w:webHidden/>
+              </w:rPr>
+              <w:instrText xml:space="preserve"> PAGEREF _Toc235725851 \h </w:instrText>
+            </w:r>
+            <w:r>
+              <w:rPr>
+                <w:noProof/>
+                <w:webHidden/>
+              </w:rPr>
+            </w:r>
+            <w:r>
+              <w:rPr>
+                <w:noProof/>
+                <w:webHidden/>
+              </w:rPr>
+              <w:fldChar w:fldCharType="separate"/>
+            </w:r>
+            <w:r>
+              <w:rPr>
+                <w:noProof/>
+                <w:webHidden/>
+              </w:rPr>
+              <w:t>4</w:t>
+            </w:r>
+            <w:r>
+              <w:rPr>
+                <w:noProof/>
+                <w:webHidden/>
+              </w:rPr>
+              <w:fldChar w:fldCharType="end"/>
+            </w:r>
+          </w:hyperlink>
+        </w:p>
+        <w:p>
+          <w:pPr>
+            <w:pStyle w:val="TDC2"/>
+            <w:tabs>
+              <w:tab w:val="right" w:leader="dot" w:pos="9350"/>
+            </w:tabs>
+            <w:rPr>
+              <w:rFonts w:asciiTheme="minorHAnsi" w:eastAsiaTheme="minorEastAsia" w:hAnsiTheme="minorHAnsi"/>
+              <w:noProof/>
+              <w:szCs w:val="24"/>
+              <w:lang w:eastAsia="es-CO"/>
+            </w:rPr>
+          </w:pPr>
+          <w:hyperlink w:anchor="_Toc235725852" w:history="1">
+            <w:r>
+              <w:rPr>
+                <w:rStyle w:val="Hipervnculo"/>
+                <w:noProof/>
+              </w:rPr>
+              <w:t>Paso 2:</w:t>
+            </w:r>
+            <w:r>
+              <w:rPr>
+                <w:noProof/>
+                <w:webHidden/>
+              </w:rPr>
+              <w:tab/>
+            </w:r>
+            <w:r>
+              <w:rPr>
+                <w:noProof/>
+                <w:webHidden/>
+              </w:rPr>
+              <w:fldChar w:fldCharType="begin"/>
+            </w:r>
+            <w:r>
+              <w:rPr>
+                <w:noProof/>
+                <w:webHidden/>
+              </w:rPr>
+              <w:instrText xml:space="preserve"> PAGEREF _Toc235725852 \h </w:instrText>
+            </w:r>
+            <w:r>
+              <w:rPr>
+                <w:noProof/>
+                <w:webHidden/>
+              </w:rPr>
+            </w:r>
+            <w:r>
+              <w:rPr>
+                <w:noProof/>
+                <w:webHidden/>
+              </w:rPr>
+              <w:fldChar w:fldCharType="separate"/>
+            </w:r>
+            <w:r>
+              <w:rPr>
+                <w:noProof/>
+                <w:webHidden/>
+              </w:rPr>
+              <w:t>5</w:t>
+            </w:r>
+            <w:r>
+              <w:rPr>
+                <w:noProof/>
+                <w:webHidden/>
+              </w:rPr>
+              <w:fldChar w:fldCharType="end"/>
+            </w:r>
+          </w:hyperlink>
+        </w:p>
+        <w:p>
+          <w:pPr>
+            <w:pStyle w:val="TDC2"/>
+            <w:tabs>
+              <w:tab w:val="right" w:leader="dot" w:pos="9350"/>
+            </w:tabs>
+            <w:rPr>
+              <w:rFonts w:asciiTheme="minorHAnsi" w:eastAsiaTheme="minorEastAsia" w:hAnsiTheme="minorHAnsi"/>
+              <w:noProof/>
+              <w:szCs w:val="24"/>
+              <w:lang w:eastAsia="es-CO"/>
+            </w:rPr>
+          </w:pPr>
+          <w:hyperlink w:anchor="_Toc235725853" w:history="1">
+            <w:r>
+              <w:rPr>
+                <w:rStyle w:val="Hipervnculo"/>
+                <w:noProof/>
+              </w:rPr>
+              <w:t>Paso 3:</w:t>
+            </w:r>
+            <w:r>
+              <w:rPr>
+                <w:noProof/>
+                <w:webHidden/>
+              </w:rPr>
+              <w:tab/>
+            </w:r>
+            <w:r>
+              <w:rPr>
+                <w:noProof/>
+                <w:webHidden/>
+              </w:rPr>
+              <w:fldChar w:fldCharType="begin"/>
+            </w:r>
+            <w:r>
+              <w:rPr>
+                <w:noProof/>
+                <w:webHidden/>
+              </w:rPr>
+              <w:instrText xml:space="preserve"> PAGEREF _Toc235725853 \h </w:instrText>
+            </w:r>
+            <w:r>
+              <w:rPr>
+                <w:noProof/>
+                <w:webHidden/>
+              </w:rPr>
+            </w:r>
+            <w:r>
+              <w:rPr>
+                <w:noProof/>
+                <w:webHidden/>
+              </w:rPr>
+              <w:fldChar w:fldCharType="separate"/>
+            </w:r>
+            <w:r>
+              <w:rPr>
+                <w:noProof/>
+                <w:webHidden/>
+              </w:rPr>
+              <w:t>5</w:t>
+            </w:r>
+            <w:r>
+              <w:rPr>
+                <w:noProof/>
+                <w:webHidden/>
+              </w:rPr>
+              <w:fldChar w:fldCharType="end"/>
+            </w:r>
+          </w:hyperlink>
+        </w:p>
+        <w:p>
+          <w:pPr>
+            <w:pStyle w:val="TDC1"/>
+            <w:rPr>
+              <w:rFonts w:asciiTheme="minorHAnsi" w:eastAsiaTheme="minorEastAsia" w:hAnsiTheme="minorHAnsi"/>
+              <w:noProof/>
+              <w:szCs w:val="24"/>
+              <w:lang w:eastAsia="es-CO"/>
+            </w:rPr>
+          </w:pPr>
+          <w:hyperlink w:anchor="_Toc235725854" w:history="1">
+            <w:r>
+              <w:rPr>
+                <w:rStyle w:val="Hipervnculo"/>
+                <w:noProof/>
+              </w:rPr>
+              <w:t>Configuración</w:t>
+            </w:r>
+            <w:r>
+              <w:rPr>
+                <w:noProof/>
+                <w:webHidden/>
+              </w:rPr>
+              <w:tab/>
+            </w:r>
+            <w:r>
+              <w:rPr>
+                <w:noProof/>
+                <w:webHidden/>
+              </w:rPr>
+              <w:fldChar w:fldCharType="begin"/>
+            </w:r>
+            <w:r>
+              <w:rPr>
+                <w:noProof/>
+                <w:webHidden/>
+              </w:rPr>
+              <w:instrText xml:space="preserve"> PAGEREF _Toc235725854 \h </w:instrText>
+            </w:r>
+            <w:r>
+              <w:rPr>
+                <w:noProof/>
+                <w:webHidden/>
+              </w:rPr>
+            </w:r>
+            <w:r>
+              <w:rPr>
+                <w:noProof/>
+                <w:webHidden/>
+              </w:rPr>
+              <w:fldChar w:fldCharType="separate"/>
+            </w:r>
+            <w:r>
+              <w:rPr>
+                <w:noProof/>
+                <w:webHidden/>
+              </w:rPr>
+              <w:t>6</w:t>
+            </w:r>
+            <w:r>
+              <w:rPr>
+                <w:noProof/>
+                <w:webHidden/>
+              </w:rPr>
+              <w:fldChar w:fldCharType="end"/>
+            </w:r>
+          </w:hyperlink>
+        </w:p>
+        <w:p>
+          <w:pPr>
+            <w:pStyle w:val="TDC2"/>
+            <w:tabs>
+              <w:tab w:val="right" w:leader="dot" w:pos="9350"/>
+            </w:tabs>
+            <w:rPr>
+              <w:rFonts w:asciiTheme="minorHAnsi" w:eastAsiaTheme="minorEastAsia" w:hAnsiTheme="minorHAnsi"/>
+              <w:noProof/>
+              <w:szCs w:val="24"/>
+              <w:lang w:eastAsia="es-CO"/>
+            </w:rPr>
+          </w:pPr>
+          <w:hyperlink w:anchor="_Toc235725855" w:history="1">
+            <w:r>
+              <w:rPr>
+                <w:rStyle w:val="Hipervnculo"/>
+                <w:noProof/>
+              </w:rPr>
+              <w:t>Paso 1:</w:t>
+            </w:r>
+            <w:r>
+              <w:rPr>
+                <w:noProof/>
+                <w:webHidden/>
+              </w:rPr>
+              <w:tab/>
+            </w:r>
+            <w:r>
+              <w:rPr>
+                <w:noProof/>
+                <w:webHidden/>
+              </w:rPr>
+              <w:fldChar w:fldCharType="begin"/>
+            </w:r>
+            <w:r>
+              <w:rPr>
+                <w:noProof/>
+                <w:webHidden/>
+              </w:rPr>
+              <w:instrText xml:space="preserve"> PAGEREF _Toc235725855 \h </w:instrText>
+            </w:r>
+            <w:r>
+              <w:rPr>
+                <w:noProof/>
+                <w:webHidden/>
+              </w:rPr>
+            </w:r>
+            <w:r>
+              <w:rPr>
+                <w:noProof/>
+                <w:webHidden/>
+              </w:rPr>
+              <w:fldChar w:fldCharType="separate"/>
+            </w:r>
+            <w:r>
+              <w:rPr>
+                <w:noProof/>
+                <w:webHidden/>
+              </w:rPr>
+              <w:t>6</w:t>
+            </w:r>
+            <w:r>
+              <w:rPr>
+                <w:noProof/>
+                <w:webHidden/>
+              </w:rPr>
+              <w:fldChar w:fldCharType="end"/>
+            </w:r>
+          </w:hyperlink>
+        </w:p>
+        <w:p>
+          <w:pPr>
+            <w:pStyle w:val="TDC2"/>
+            <w:tabs>
+              <w:tab w:val="right" w:leader="dot" w:pos="9350"/>
+            </w:tabs>
+            <w:rPr>
+              <w:rFonts w:asciiTheme="minorHAnsi" w:eastAsiaTheme="minorEastAsia" w:hAnsiTheme="minorHAnsi"/>
+              <w:noProof/>
+              <w:szCs w:val="24"/>
+              <w:lang w:eastAsia="es-CO"/>
+            </w:rPr>
+          </w:pPr>
+          <w:hyperlink w:anchor="_Toc235725856" w:history="1">
+            <w:r>
+              <w:rPr>
+                <w:rStyle w:val="Hipervnculo"/>
+                <w:noProof/>
+              </w:rPr>
+              <w:t>Paso 2:</w:t>
+            </w:r>
+            <w:r>
+              <w:rPr>
+                <w:noProof/>
+                <w:webHidden/>
+              </w:rPr>
+              <w:tab/>
+            </w:r>
+            <w:r>
+              <w:rPr>
+                <w:noProof/>
+                <w:webHidden/>
+              </w:rPr>
+              <w:fldChar w:fldCharType="begin"/>
+            </w:r>
+            <w:r>
+              <w:rPr>
+                <w:noProof/>
+                <w:webHidden/>
+              </w:rPr>
+              <w:instrText xml:space="preserve"> PAGEREF _Toc235725856 \h </w:instrText>
+            </w:r>
+            <w:r>
+              <w:rPr>
+                <w:noProof/>
+                <w:webHidden/>
+              </w:rPr>
+            </w:r>
+            <w:r>
+              <w:rPr>
+                <w:noProof/>
+                <w:webHidden/>
+              </w:rPr>
+              <w:fldChar w:fldCharType="separate"/>
+            </w:r>
+            <w:r>
+              <w:rPr>
+                <w:noProof/>
+                <w:webHidden/>
+              </w:rPr>
+              <w:t>6</w:t>
+            </w:r>
+            <w:r>
+              <w:rPr>
+                <w:noProof/>
+                <w:webHidden/>
+              </w:rPr>
+              <w:fldChar w:fldCharType="end"/>
+            </w:r>
+          </w:hyperlink>
+        </w:p>
+        <w:p>
+          <w:pPr>
+            <w:pStyle w:val="TDC2"/>
+            <w:tabs>
+              <w:tab w:val="right" w:leader="dot" w:pos="9350"/>
+            </w:tabs>
+            <w:rPr>
+              <w:rFonts w:asciiTheme="minorHAnsi" w:eastAsiaTheme="minorEastAsia" w:hAnsiTheme="minorHAnsi"/>
+              <w:noProof/>
+              <w:szCs w:val="24"/>
+              <w:lang w:eastAsia="es-CO"/>
+            </w:rPr>
+          </w:pPr>
+          <w:hyperlink w:anchor="_Toc235725857" w:history="1">
+            <w:r>
+              <w:rPr>
+                <w:rStyle w:val="Hipervnculo"/>
+                <w:noProof/>
+              </w:rPr>
+              <w:t>Paso 3:</w:t>
+            </w:r>
+            <w:r>
+              <w:rPr>
+                <w:noProof/>
+                <w:webHidden/>
+              </w:rPr>
+              <w:tab/>
+            </w:r>
+            <w:r>
+              <w:rPr>
+                <w:noProof/>
+                <w:webHidden/>
+              </w:rPr>
+              <w:fldChar w:fldCharType="begin"/>
+            </w:r>
+            <w:r>
+              <w:rPr>
+                <w:noProof/>
+                <w:webHidden/>
+              </w:rPr>
+              <w:instrText xml:space="preserve"> PAGEREF _Toc235725857 \h </w:instrText>
+            </w:r>
+            <w:r>
+              <w:rPr>
+                <w:noProof/>
+                <w:webHidden/>
+              </w:rPr>
+            </w:r>
+            <w:r>
+              <w:rPr>
+                <w:noProof/>
+                <w:webHidden/>
+              </w:rPr>
+              <w:fldChar w:fldCharType="separate"/>
+            </w:r>
+            <w:r>
+              <w:rPr>
+                <w:noProof/>
+                <w:webHidden/>
+              </w:rPr>
+              <w:t>6</w:t>
+            </w:r>
+            <w:r>
+              <w:rPr>
+                <w:noProof/>
+                <w:webHidden/>
+              </w:rPr>
+              <w:fldChar w:fldCharType="end"/>
+            </w:r>
+          </w:hyperlink>
+        </w:p>
+        <w:p>
+          <w:pPr>
+            <w:pStyle w:val="TDC1"/>
+            <w:rPr>
+              <w:rFonts w:asciiTheme="minorHAnsi" w:eastAsiaTheme="minorEastAsia" w:hAnsiTheme="minorHAnsi"/>
+              <w:noProof/>
+              <w:szCs w:val="24"/>
+              <w:lang w:eastAsia="es-CO"/>
+            </w:rPr>
+          </w:pPr>
+          <w:hyperlink w:anchor="_Toc235725858" w:history="1">
+            <w:r>
+              <w:rPr>
+                <w:rStyle w:val="Hipervnculo"/>
+                <w:noProof/>
+              </w:rPr>
+              <w:t>Verificación</w:t>
+            </w:r>
+            <w:r>
+              <w:rPr>
+                <w:noProof/>
+                <w:webHidden/>
+              </w:rPr>
+              <w:tab/>
+            </w:r>
+            <w:r>
+              <w:rPr>
+                <w:noProof/>
+                <w:webHidden/>
+              </w:rPr>
+              <w:fldChar w:fldCharType="begin"/>
+            </w:r>
+            <w:r>
+              <w:rPr>
+                <w:noProof/>
+                <w:webHidden/>
+              </w:rPr>
+              <w:instrText xml:space="preserve"> PAGEREF _Toc235725858 \h </w:instrText>
+            </w:r>
+            <w:r>
+              <w:rPr>
+                <w:noProof/>
+                <w:webHidden/>
+              </w:rPr>
+            </w:r>
+            <w:r>
+              <w:rPr>
+                <w:noProof/>
+                <w:webHidden/>
+              </w:rPr>
+              <w:fldChar w:fldCharType="separate"/>
+            </w:r>
+            <w:r>
+              <w:rPr>
+                <w:noProof/>
+                <w:webHidden/>
+              </w:rPr>
+              <w:t>7</w:t>
+            </w:r>
+            <w:r>
+              <w:rPr>
+                <w:noProof/>
+                <w:webHidden/>
+              </w:rPr>
+              <w:fldChar w:fldCharType="end"/>
+            </w:r>
+          </w:hyperlink>
+        </w:p>
+        <w:p>
+          <w:pPr>
+            <w:pStyle w:val="TDC1"/>
+            <w:rPr>
+              <w:rFonts w:asciiTheme="minorHAnsi" w:eastAsiaTheme="minorEastAsia" w:hAnsiTheme="minorHAnsi"/>
+              <w:noProof/>
+              <w:szCs w:val="24"/>
+              <w:lang w:eastAsia="es-CO"/>
+            </w:rPr>
+          </w:pPr>
+          <w:hyperlink w:anchor="_Toc235725859" w:history="1">
+            <w:r>
+              <w:rPr>
+                <w:rStyle w:val="Hipervnculo"/>
+                <w:noProof/>
+              </w:rPr>
+              <w:t>Anexos</w:t>
+            </w:r>
+            <w:r>
+              <w:rPr>
+                <w:noProof/>
+                <w:webHidden/>
+              </w:rPr>
+              <w:tab/>
+            </w:r>
+            <w:r>
+              <w:rPr>
+                <w:noProof/>
+                <w:webHidden/>
+              </w:rPr>
+              <w:fldChar w:fldCharType="begin"/>
+            </w:r>
+            <w:r>
+              <w:rPr>
+                <w:noProof/>
+                <w:webHidden/>
+              </w:rPr>
+              <w:instrText xml:space="preserve"> PAGEREF _Toc235725859 \h </w:instrText>
+            </w:r>
+            <w:r>
+              <w:rPr>
+                <w:noProof/>
+                <w:webHidden/>
+              </w:rPr>
+            </w:r>
+            <w:r>
+              <w:rPr>
+                <w:noProof/>
+                <w:webHidden/>
+              </w:rPr>
+              <w:fldChar w:fldCharType="separate"/>
+            </w:r>
+            <w:r>
+              <w:rPr>
+                <w:noProof/>
+                <w:webHidden/>
+              </w:rPr>
+              <w:t>7</w:t>
+            </w:r>
+            <w:r>
+              <w:rPr>
+                <w:noProof/>
+                <w:webHidden/>
+              </w:rPr>
+              <w:fldChar w:fldCharType="end"/>
+            </w:r>
+          </w:hyperlink>
+        </w:p>
+        <w:p>
+          <w:pPr>
+            <w:pStyle w:val="TDC2"/>
+            <w:tabs>
+              <w:tab w:val="right" w:leader="dot" w:pos="9350"/>
+            </w:tabs>
+            <w:rPr>
+              <w:rFonts w:asciiTheme="minorHAnsi" w:eastAsiaTheme="minorEastAsia" w:hAnsiTheme="minorHAnsi"/>
+              <w:noProof/>
+              <w:szCs w:val="24"/>
+              <w:lang w:eastAsia="es-CO"/>
+            </w:rPr>
+          </w:pPr>
+          <w:hyperlink w:anchor="_Toc235725860" w:history="1">
+            <w:r>
+              <w:rPr>
+                <w:rStyle w:val="Hipervnculo"/>
+                <w:noProof/>
+              </w:rPr>
+              <w:t>Tabla 2</w:t>
+            </w:r>
+            <w:r>
+              <w:rPr>
+                <w:noProof/>
+                <w:webHidden/>
+              </w:rPr>
+              <w:tab/>
+            </w:r>
+            <w:r>
+              <w:rPr>
+                <w:noProof/>
+                <w:webHidden/>
+              </w:rPr>
+              <w:fldChar w:fldCharType="begin"/>
+            </w:r>
+            <w:r>
+              <w:rPr>
+                <w:noProof/>
+                <w:webHidden/>
+              </w:rPr>
+              <w:instrText xml:space="preserve"> PAGEREF _Toc235725860 \h </w:instrText>
+            </w:r>
+            <w:r>
+              <w:rPr>
+                <w:noProof/>
+                <w:webHidden/>
+              </w:rPr>
+            </w:r>
+            <w:r>
+              <w:rPr>
+                <w:noProof/>
+                <w:webHidden/>
+              </w:rPr>
+              <w:fldChar w:fldCharType="separate"/>
+            </w:r>
+            <w:r>
+              <w:rPr>
+                <w:noProof/>
+                <w:webHidden/>
+              </w:rPr>
+              <w:t>7</w:t>
+            </w:r>
+            <w:r>
+              <w:rPr>
+                <w:noProof/>
+                <w:webHidden/>
+              </w:rPr>
+              <w:fldChar w:fldCharType="end"/>
+            </w:r>
+          </w:hyperlink>
+        </w:p>
+        <w:p>
+          <w:pPr>
+            <w:pStyle w:val="TDC2"/>
+            <w:tabs>
+              <w:tab w:val="right" w:leader="dot" w:pos="9350"/>
+            </w:tabs>
+            <w:rPr>
+              <w:rFonts w:asciiTheme="minorHAnsi" w:eastAsiaTheme="minorEastAsia" w:hAnsiTheme="minorHAnsi"/>
+              <w:noProof/>
+              <w:szCs w:val="24"/>
+              <w:lang w:eastAsia="es-CO"/>
+            </w:rPr>
+          </w:pPr>
+          <w:hyperlink w:anchor="_Toc235725861" w:history="1">
+            <w:r>
+              <w:rPr>
+                <w:rStyle w:val="Hipervnculo"/>
+                <w:noProof/>
+              </w:rPr>
+              <w:t>Glosario</w:t>
+            </w:r>
+            <w:r>
+              <w:rPr>
+                <w:noProof/>
+                <w:webHidden/>
+              </w:rPr>
+              <w:tab/>
+            </w:r>
+            <w:r>
+              <w:rPr>
+                <w:noProof/>
+                <w:webHidden/>
+              </w:rPr>
+              <w:fldChar w:fldCharType="begin"/>
+            </w:r>
+            <w:r>
+              <w:rPr>
+                <w:noProof/>
+                <w:webHidden/>
+              </w:rPr>
+              <w:instrText xml:space="preserve"> PAGEREF _Toc235725861 \h </w:instrText>
+            </w:r>
+            <w:r>
+              <w:rPr>
+                <w:noProof/>
+                <w:webHidden/>
+              </w:rPr>
+            </w:r>
+            <w:r>
+              <w:rPr>
+                <w:noProof/>
+                <w:webHidden/>
+              </w:rPr>
+              <w:fldChar w:fldCharType="separate"/>
+            </w:r>
+            <w:r>
+              <w:rPr>
+                <w:noProof/>
+                <w:webHidden/>
+              </w:rPr>
+              <w:t>7</w:t>
+            </w:r>
+            <w:r>
+              <w:rPr>
+                <w:noProof/>
+                <w:webHidden/>
+              </w:rPr>
+              <w:fldChar w:fldCharType="end"/>
+            </w:r>
+          </w:hyperlink>
+        </w:p>
+        <w:p>
+          <w:pPr>
+            <w:pStyle w:val="TDC1"/>
+            <w:rPr>
+              <w:rFonts w:asciiTheme="minorHAnsi" w:eastAsiaTheme="minorEastAsia" w:hAnsiTheme="minorHAnsi"/>
+              <w:noProof/>
+              <w:szCs w:val="24"/>
+              <w:lang w:eastAsia="es-CO"/>
+            </w:rPr>
+          </w:pPr>
+          <w:hyperlink w:anchor="_Toc235725862" w:history="1">
+            <w:r>
+              <w:rPr>
+                <w:rStyle w:val="Hipervnculo"/>
+                <w:noProof/>
+              </w:rPr>
+              <w:t>Rol 1</w:t>
+            </w:r>
+            <w:r>
+              <w:rPr>
+                <w:noProof/>
+                <w:webHidden/>
+              </w:rPr>
+              <w:tab/>
+            </w:r>
+            <w:r>
+              <w:rPr>
+                <w:noProof/>
+                <w:webHidden/>
+              </w:rPr>
+              <w:fldChar w:fldCharType="begin"/>
+            </w:r>
+            <w:r>
+              <w:rPr>
+                <w:noProof/>
+                <w:webHidden/>
+              </w:rPr>
+              <w:instrText xml:space="preserve"> PAGEREF _Toc235725862 \h </w:instrText>
+            </w:r>
+            <w:r>
+              <w:rPr>
+                <w:noProof/>
+                <w:webHidden/>
+              </w:rPr>
+            </w:r>
+            <w:r>
+              <w:rPr>
+                <w:noProof/>
+                <w:webHidden/>
+              </w:rPr>
+              <w:fldChar w:fldCharType="separate"/>
+            </w:r>
+            <w:r>
+              <w:rPr>
+                <w:noProof/>
+                <w:webHidden/>
+              </w:rPr>
+              <w:t>7</w:t>
+            </w:r>
+            <w:r>
+              <w:rPr>
+                <w:noProof/>
+                <w:webHidden/>
+              </w:rPr>
+              <w:fldChar w:fldCharType="end"/>
+            </w:r>
+          </w:hyperlink>
+        </w:p>
+        <w:p>
+          <w:pPr>
+            <w:pStyle w:val="TDC2"/>
+            <w:tabs>
+              <w:tab w:val="right" w:leader="dot" w:pos="9350"/>
+            </w:tabs>
+            <w:rPr>
+              <w:rFonts w:asciiTheme="minorHAnsi" w:eastAsiaTheme="minorEastAsia" w:hAnsiTheme="minorHAnsi"/>
+              <w:noProof/>
+              <w:szCs w:val="24"/>
+              <w:lang w:eastAsia="es-CO"/>
+            </w:rPr>
+          </w:pPr>
+          <w:hyperlink w:anchor="_Toc235725863" w:history="1">
+            <w:r>
+              <w:rPr>
+                <w:rStyle w:val="Hipervnculo"/>
+                <w:noProof/>
+              </w:rPr>
+              <w:t>Redactor</w:t>
+            </w:r>
+            <w:r>
+              <w:rPr>
+                <w:noProof/>
+                <w:webHidden/>
+              </w:rPr>
+              <w:tab/>
+            </w:r>
+            <w:r>
+              <w:rPr>
+                <w:noProof/>
+                <w:webHidden/>
+              </w:rPr>
+              <w:fldChar w:fldCharType="begin"/>
+            </w:r>
+            <w:r>
+              <w:rPr>
+                <w:noProof/>
+                <w:webHidden/>
+              </w:rPr>
+              <w:instrText xml:space="preserve"> PAGEREF _Toc235725863 \h </w:instrText>
+            </w:r>
+            <w:r>
+              <w:rPr>
+                <w:noProof/>
+                <w:webHidden/>
+              </w:rPr>
+            </w:r>
+            <w:r>
+              <w:rPr>
+                <w:noProof/>
+                <w:webHidden/>
+              </w:rPr>
+              <w:fldChar w:fldCharType="separate"/>
+            </w:r>
+            <w:r>
+              <w:rPr>
+                <w:noProof/>
+                <w:webHidden/>
+              </w:rPr>
+              <w:t>7</w:t>
+            </w:r>
+            <w:r>
+              <w:rPr>
+                <w:noProof/>
+                <w:webHidden/>
+              </w:rPr>
+              <w:fldChar w:fldCharType="end"/>
+            </w:r>
+          </w:hyperlink>
+        </w:p>
+        <w:p>
+          <w:pPr>
+            <w:pStyle w:val="TDC1"/>
+            <w:rPr>
+              <w:rFonts w:asciiTheme="minorHAnsi" w:eastAsiaTheme="minorEastAsia" w:hAnsiTheme="minorHAnsi"/>
+              <w:noProof/>
+              <w:szCs w:val="24"/>
+              <w:lang w:eastAsia="es-CO"/>
+            </w:rPr>
+          </w:pPr>
+          <w:hyperlink w:anchor="_Toc235725864" w:history="1">
+            <w:r>
+              <w:rPr>
+                <w:rStyle w:val="Hipervnculo"/>
+                <w:noProof/>
+              </w:rPr>
+              <w:t>Rol 2</w:t>
+            </w:r>
+            <w:r>
+              <w:rPr>
+                <w:noProof/>
+                <w:webHidden/>
+              </w:rPr>
+              <w:tab/>
+            </w:r>
+            <w:r>
+              <w:rPr>
+                <w:noProof/>
+                <w:webHidden/>
+              </w:rPr>
+              <w:fldChar w:fldCharType="begin"/>
+            </w:r>
+            <w:r>
+              <w:rPr>
+                <w:noProof/>
+                <w:webHidden/>
+              </w:rPr>
+              <w:instrText xml:space="preserve"> PAGEREF _Toc235725864 \h </w:instrText>
+            </w:r>
+            <w:r>
+              <w:rPr>
+                <w:noProof/>
+                <w:webHidden/>
+              </w:rPr>
+            </w:r>
+            <w:r>
+              <w:rPr>
+                <w:noProof/>
+                <w:webHidden/>
+              </w:rPr>
+              <w:fldChar w:fldCharType="separate"/>
+            </w:r>
+            <w:r>
+              <w:rPr>
+                <w:noProof/>
+                <w:webHidden/>
+              </w:rPr>
+              <w:t>8</w:t>
+            </w:r>
+            <w:r>
+              <w:rPr>
+                <w:noProof/>
+                <w:webHidden/>
+              </w:rPr>
+              <w:fldChar w:fldCharType="end"/>
+            </w:r>
+          </w:hyperlink>
+        </w:p>
+        <w:p>
+          <w:pPr>
+            <w:pStyle w:val="TDC2"/>
+            <w:tabs>
+              <w:tab w:val="right" w:leader="dot" w:pos="9350"/>
+            </w:tabs>
+            <w:rPr>
+              <w:rFonts w:asciiTheme="minorHAnsi" w:eastAsiaTheme="minorEastAsia" w:hAnsiTheme="minorHAnsi"/>
+              <w:noProof/>
+              <w:szCs w:val="24"/>
+              <w:lang w:eastAsia="es-CO"/>
+            </w:rPr>
+          </w:pPr>
+          <w:hyperlink w:anchor="_Toc235725865" w:history="1">
+            <w:r>
+              <w:rPr>
+                <w:rStyle w:val="Hipervnculo"/>
+                <w:noProof/>
+              </w:rPr>
+              <w:t>Revisor</w:t>
+            </w:r>
+            <w:r>
+              <w:rPr>
+                <w:noProof/>
+                <w:webHidden/>
+              </w:rPr>
+              <w:tab/>
+            </w:r>
+            <w:r>
+              <w:rPr>
+                <w:noProof/>
+                <w:webHidden/>
+              </w:rPr>
+              <w:fldChar w:fldCharType="begin"/>
+            </w:r>
+            <w:r>
+              <w:rPr>
+                <w:noProof/>
+                <w:webHidden/>
+              </w:rPr>
+              <w:instrText xml:space="preserve"> PAGEREF _Toc235725865 \h </w:instrText>
+            </w:r>
+            <w:r>
+              <w:rPr>
+                <w:noProof/>
+                <w:webHidden/>
+              </w:rPr>
+            </w:r>
+            <w:r>
+              <w:rPr>
+                <w:noProof/>
+                <w:webHidden/>
+              </w:rPr>
+              <w:fldChar w:fldCharType="separate"/>
+            </w:r>
+            <w:r>
+              <w:rPr>
+                <w:noProof/>
+                <w:webHidden/>
+              </w:rPr>
+              <w:t>8</w:t>
+            </w:r>
+            <w:r>
+              <w:rPr>
+                <w:noProof/>
+                <w:webHidden/>
+              </w:rPr>
+              <w:fldChar w:fldCharType="end"/>
+            </w:r>
+          </w:hyperlink>
+        </w:p>
+        <w:p>
+          <w:pPr>
+            <w:pStyle w:val="TDC1"/>
+            <w:rPr>
+              <w:rFonts w:asciiTheme="minorHAnsi" w:eastAsiaTheme="minorEastAsia" w:hAnsiTheme="minorHAnsi"/>
+              <w:noProof/>
+              <w:szCs w:val="24"/>
+              <w:lang w:eastAsia="es-CO"/>
+            </w:rPr>
+          </w:pPr>
+          <w:hyperlink w:anchor="_Toc235725866" w:history="1">
+            <w:r>
+              <w:rPr>
+                <w:noProof/>
+                <w:webHidden/>
+              </w:rPr>
+              <w:tab/>
+            </w:r>
+            <w:r>
+              <w:rPr>
+                <w:noProof/>
+                <w:webHidden/>
+              </w:rPr>
+              <w:fldChar w:fldCharType="begin"/>
+            </w:r>
+            <w:r>
+              <w:rPr>
+                <w:noProof/>
+                <w:webHidden/>
+              </w:rPr>
+              <w:instrText xml:space="preserve"> PAGEREF _Toc235725866 \h </w:instrText>
+            </w:r>
+            <w:r>
+              <w:rPr>
+                <w:noProof/>
+                <w:webHidden/>
+              </w:rPr>
+            </w:r>
+            <w:r>
+              <w:rPr>
+                <w:noProof/>
+                <w:webHidden/>
+              </w:rPr>
+              <w:fldChar w:fldCharType="separate"/>
+            </w:r>
+            <w:r>
+              <w:rPr>
+                <w:noProof/>
+                <w:webHidden/>
+              </w:rPr>
+              <w:t>8</w:t>
+            </w:r>
+            <w:r>
+              <w:rPr>
+                <w:noProof/>
+                <w:webHidden/>
+              </w:rPr>
+              <w:fldChar w:fldCharType="end"/>
+            </w:r>
+          </w:hyperlink>
+        </w:p>
+        <w:p>
+          <w:pPr>
+            <w:pStyle w:val="TDC1"/>
+            <w:rPr>
+              <w:rFonts w:asciiTheme="minorHAnsi" w:eastAsiaTheme="minorEastAsia" w:hAnsiTheme="minorHAnsi"/>
+              <w:noProof/>
+              <w:szCs w:val="24"/>
+              <w:lang w:eastAsia="es-CO"/>
+            </w:rPr>
+          </w:pPr>
+          <w:hyperlink w:anchor="_Toc235725867" w:history="1">
+            <w:r>
+              <w:rPr>
+                <w:rStyle w:val="Hipervnculo"/>
+                <w:noProof/>
+              </w:rPr>
+              <w:t>Rol 3</w:t>
+            </w:r>
+            <w:r>
+              <w:rPr>
+                <w:noProof/>
+                <w:webHidden/>
+              </w:rPr>
+              <w:tab/>
+            </w:r>
+            <w:r>
+              <w:rPr>
+                <w:noProof/>
+                <w:webHidden/>
+              </w:rPr>
+              <w:fldChar w:fldCharType="begin"/>
+            </w:r>
+            <w:r>
+              <w:rPr>
+                <w:noProof/>
+                <w:webHidden/>
+              </w:rPr>
+              <w:instrText xml:space="preserve"> PAGEREF _Toc235725867 \h </w:instrText>
+            </w:r>
+            <w:r>
+              <w:rPr>
+                <w:noProof/>
+                <w:webHidden/>
+              </w:rPr>
+            </w:r>
+            <w:r>
+              <w:rPr>
+                <w:noProof/>
+                <w:webHidden/>
+              </w:rPr>
+              <w:fldChar w:fldCharType="separate"/>
+            </w:r>
+            <w:r>
+              <w:rPr>
+                <w:noProof/>
+                <w:webHidden/>
+              </w:rPr>
+              <w:t>8</w:t>
+            </w:r>
+            <w:r>
+              <w:rPr>
+                <w:noProof/>
+                <w:webHidden/>
+              </w:rPr>
+              <w:fldChar w:fldCharType="end"/>
+            </w:r>
+          </w:hyperlink>
+        </w:p>
+        <w:p>
+          <w:pPr>
+            <w:pStyle w:val="TDC2"/>
+            <w:tabs>
+              <w:tab w:val="right" w:leader="dot" w:pos="9350"/>
+            </w:tabs>
+            <w:rPr>
+              <w:rFonts w:asciiTheme="minorHAnsi" w:eastAsiaTheme="minorEastAsia" w:hAnsiTheme="minorHAnsi"/>
+              <w:noProof/>
+              <w:szCs w:val="24"/>
+              <w:lang w:eastAsia="es-CO"/>
+            </w:rPr>
+          </w:pPr>
+          <w:hyperlink w:anchor="_Toc235725868" w:history="1">
+            <w:r>
+              <w:rPr>
+                <w:rStyle w:val="Hipervnculo"/>
+                <w:noProof/>
+              </w:rPr>
+              <w:t>Editor</w:t>
+            </w:r>
+            <w:r>
+              <w:rPr>
+                <w:noProof/>
+                <w:webHidden/>
+              </w:rPr>
+              <w:tab/>
+            </w:r>
+            <w:r>
+              <w:rPr>
+                <w:noProof/>
+                <w:webHidden/>
+              </w:rPr>
+              <w:fldChar w:fldCharType="begin"/>
+            </w:r>
+            <w:r>
+              <w:rPr>
+                <w:noProof/>
+                <w:webHidden/>
+              </w:rPr>
+              <w:instrText xml:space="preserve"> PAGEREF _Toc235725868 \h </w:instrText>
+            </w:r>
+            <w:r>
+              <w:rPr>
+                <w:noProof/>
+                <w:webHidden/>
+              </w:rPr>
+            </w:r>
+            <w:r>
+              <w:rPr>
+                <w:noProof/>
+                <w:webHidden/>
+              </w:rPr>
+              <w:fldChar w:fldCharType="separate"/>
+            </w:r>
+            <w:r>
+              <w:rPr>
+                <w:noProof/>
+                <w:webHidden/>
+              </w:rPr>
+              <w:t>8</w:t>
+            </w:r>
+            <w:r>
+              <w:rPr>
+                <w:noProof/>
+                <w:webHidden/>
+              </w:rPr>
+              <w:fldChar w:fldCharType="end"/>
+            </w:r>
+          </w:hyperlink>
+        </w:p>
+        <w:p>
+          <w:pPr>
+            <w:pStyle w:val="TDC2"/>
+            <w:tabs>
+              <w:tab w:val="right" w:leader="dot" w:pos="9350"/>
+            </w:tabs>
+            <w:rPr>
+              <w:rFonts w:asciiTheme="minorHAnsi" w:eastAsiaTheme="minorEastAsia" w:hAnsiTheme="minorHAnsi"/>
+              <w:noProof/>
+              <w:szCs w:val="24"/>
+              <w:lang w:eastAsia="es-CO"/>
+            </w:rPr>
+          </w:pPr>
+          <w:hyperlink w:anchor="_Toc235725869" w:history="1">
+            <w:r>
+              <w:rPr>
+                <w:rStyle w:val="Hipervnculo"/>
+                <w:noProof/>
+              </w:rPr>
+              <w:t>Tabla 3</w:t>
+            </w:r>
+            <w:r>
+              <w:rPr>
+                <w:noProof/>
+                <w:webHidden/>
+              </w:rPr>
+              <w:tab/>
+            </w:r>
+            <w:r>
+              <w:rPr>
+                <w:noProof/>
+                <w:webHidden/>
+              </w:rPr>
+              <w:fldChar w:fldCharType="begin"/>
+            </w:r>
+            <w:r>
+              <w:rPr>
+                <w:noProof/>
+                <w:webHidden/>
+              </w:rPr>
+              <w:instrText xml:space="preserve"> PAGEREF _Toc235725869 \h </w:instrText>
+            </w:r>
+            <w:r>
+              <w:rPr>
+                <w:noProof/>
+                <w:webHidden/>
+              </w:rPr>
+            </w:r>
+            <w:r>
+              <w:rPr>
+                <w:noProof/>
+                <w:webHidden/>
+              </w:rPr>
+              <w:fldChar w:fldCharType="separate"/>
+            </w:r>
+            <w:r>
+              <w:rPr>
+                <w:noProof/>
+                <w:webHidden/>
+              </w:rPr>
+              <w:t>9</w:t>
+            </w:r>
+            <w:r>
+              <w:rPr>
+                <w:noProof/>
+                <w:webHidden/>
+              </w:rPr>
+              <w:fldChar w:fldCharType="end"/>
+            </w:r>
+          </w:hyperlink>
+        </w:p>
+        <w:p>
+          <w:pPr>
+            <w:pStyle w:val="TDC2"/>
+            <w:tabs>
+              <w:tab w:val="right" w:leader="dot" w:pos="9350"/>
+            </w:tabs>
+            <w:rPr>
+              <w:rFonts w:asciiTheme="minorHAnsi" w:eastAsiaTheme="minorEastAsia" w:hAnsiTheme="minorHAnsi"/>
+              <w:noProof/>
+              <w:szCs w:val="24"/>
+              <w:lang w:eastAsia="es-CO"/>
+            </w:rPr>
+          </w:pPr>
+          <w:hyperlink w:anchor="_Toc235725870" w:history="1">
+            <w:r>
+              <w:rPr>
+                <w:rStyle w:val="Hipervnculo"/>
+                <w:noProof/>
+              </w:rPr>
+              <w:t>Registro de Versiones</w:t>
+            </w:r>
+            <w:r>
+              <w:rPr>
+                <w:noProof/>
+                <w:webHidden/>
+              </w:rPr>
+              <w:tab/>
+            </w:r>
+            <w:r>
+              <w:rPr>
+                <w:noProof/>
+                <w:webHidden/>
+              </w:rPr>
+              <w:fldChar w:fldCharType="begin"/>
+            </w:r>
+            <w:r>
+              <w:rPr>
+                <w:noProof/>
+                <w:webHidden/>
+              </w:rPr>
+              <w:instrText xml:space="preserve"> PAGEREF _Toc235725870 \h </w:instrText>
+            </w:r>
+            <w:r>
+              <w:rPr>
+                <w:noProof/>
+                <w:webHidden/>
+              </w:rPr>
+            </w:r>
+            <w:r>
+              <w:rPr>
+                <w:noProof/>
+                <w:webHidden/>
+              </w:rPr>
+              <w:fldChar w:fldCharType="separate"/>
+            </w:r>
+            <w:r>
+              <w:rPr>
+                <w:noProof/>
+                <w:webHidden/>
+              </w:rPr>
+              <w:t>9</w:t>
+            </w:r>
+            <w:r>
+              <w:rPr>
+                <w:noProof/>
+                <w:webHidden/>
+              </w:rPr>
+              <w:fldChar w:fldCharType="end"/>
+            </w:r>
+          </w:hyperlink>
+        </w:p>
+        <w:p>
+          <w:pPr>
+            <w:pStyle w:val="TDC2"/>
+            <w:tabs>
+              <w:tab w:val="right" w:leader="dot" w:pos="9350"/>
+            </w:tabs>
+            <w:rPr>
+              <w:rFonts w:asciiTheme="minorHAnsi" w:eastAsiaTheme="minorEastAsia" w:hAnsiTheme="minorHAnsi"/>
+              <w:noProof/>
+              <w:szCs w:val="24"/>
+              <w:lang w:eastAsia="es-CO"/>
+            </w:rPr>
+          </w:pPr>
+          <w:hyperlink w:anchor="_Toc235725871" w:history="1">
+            <w:r>
+              <w:rPr>
+                <w:rStyle w:val="Hipervnculo"/>
+                <w:noProof/>
+              </w:rPr>
+              <w:t>Tabla 4</w:t>
+            </w:r>
+            <w:r>
+              <w:rPr>
+                <w:noProof/>
+                <w:webHidden/>
+              </w:rPr>
+              <w:tab/>
+            </w:r>
+            <w:r>
+              <w:rPr>
+                <w:noProof/>
+                <w:webHidden/>
+              </w:rPr>
+              <w:fldChar w:fldCharType="begin"/>
+            </w:r>
+            <w:r>
+              <w:rPr>
+                <w:noProof/>
+                <w:webHidden/>
+              </w:rPr>
+              <w:instrText xml:space="preserve"> PAGEREF _Toc235725871 \h </w:instrText>
+            </w:r>
+            <w:r>
+              <w:rPr>
+                <w:noProof/>
+                <w:webHidden/>
+              </w:rPr>
+            </w:r>
+            <w:r>
+              <w:rPr>
+                <w:noProof/>
+                <w:webHidden/>
+              </w:rPr>
+              <w:fldChar w:fldCharType="separate"/>
+            </w:r>
+            <w:r>
+              <w:rPr>
+                <w:noProof/>
+                <w:webHidden/>
+              </w:rPr>
+              <w:t>9</w:t>
+            </w:r>
+            <w:r>
+              <w:rPr>
+                <w:noProof/>
+                <w:webHidden/>
+              </w:rPr>
+              <w:fldChar w:fldCharType="end"/>
+            </w:r>
+          </w:hyperlink>
+        </w:p>
+        <w:p>
+          <w:pPr>
+            <w:pStyle w:val="TDC2"/>
+            <w:tabs>
+              <w:tab w:val="right" w:leader="dot" w:pos="9350"/>
+            </w:tabs>
+            <w:rPr>
+              <w:rFonts w:asciiTheme="minorHAnsi" w:eastAsiaTheme="minorEastAsia" w:hAnsiTheme="minorHAnsi"/>
+              <w:noProof/>
+              <w:szCs w:val="24"/>
+              <w:lang w:eastAsia="es-CO"/>
+            </w:rPr>
+          </w:pPr>
+          <w:hyperlink w:anchor="_Toc235725872" w:history="1">
+            <w:r>
+              <w:rPr>
+                <w:rStyle w:val="Hipervnculo"/>
+                <w:noProof/>
+              </w:rPr>
+              <w:t>Resumen de Cambios</w:t>
+            </w:r>
+            <w:r>
+              <w:rPr>
+                <w:noProof/>
+                <w:webHidden/>
+              </w:rPr>
+              <w:tab/>
+            </w:r>
+            <w:r>
+              <w:rPr>
+                <w:noProof/>
+                <w:webHidden/>
+              </w:rPr>
+              <w:fldChar w:fldCharType="begin"/>
+            </w:r>
+            <w:r>
+              <w:rPr>
+                <w:noProof/>
+                <w:webHidden/>
+              </w:rPr>
+              <w:instrText xml:space="preserve"> PAGEREF _Toc235725872 \h </w:instrText>
+            </w:r>
+            <w:r>
+              <w:rPr>
+                <w:noProof/>
+                <w:webHidden/>
+              </w:rPr>
+            </w:r>
+            <w:r>
+              <w:rPr>
+                <w:noProof/>
+                <w:webHidden/>
+              </w:rPr>
+              <w:fldChar w:fldCharType="separate"/>
+            </w:r>
+            <w:r>
+              <w:rPr>
+                <w:noProof/>
+                <w:webHidden/>
+              </w:rPr>
+              <w:t>9</w:t>
+            </w:r>
+            <w:r>
+              <w:rPr>
+                <w:noProof/>
+                <w:webHidden/>
+              </w:rPr>
+              <w:fldChar w:fldCharType="end"/>
+            </w:r>
+          </w:hyperlink>
+        </w:p>
+        <w:p>
+          <w:pPr>
+            <w:pStyle w:val="TDC1"/>
+            <w:rPr>
+              <w:rFonts w:asciiTheme="minorHAnsi" w:eastAsiaTheme="minorEastAsia" w:hAnsiTheme="minorHAnsi"/>
+              <w:noProof/>
+              <w:szCs w:val="24"/>
+              <w:lang w:eastAsia="es-CO"/>
+            </w:rPr>
+          </w:pPr>
+          <w:hyperlink w:anchor="_Toc235725873" w:history="1">
+            <w:r>
+              <w:rPr>
+                <w:rStyle w:val="Hipervnculo"/>
+                <w:noProof/>
+              </w:rPr>
+              <w:t>Reflexión</w:t>
+            </w:r>
+            <w:r>
+              <w:rPr>
+                <w:noProof/>
+                <w:webHidden/>
+              </w:rPr>
+              <w:tab/>
+            </w:r>
+            <w:r>
+              <w:rPr>
+                <w:noProof/>
+                <w:webHidden/>
+              </w:rPr>
+              <w:fldChar w:fldCharType="begin"/>
+            </w:r>
+            <w:r>
+              <w:rPr>
+                <w:noProof/>
+                <w:webHidden/>
+              </w:rPr>
+              <w:instrText xml:space="preserve"> PAGEREF _Toc235725873 \h </w:instrText>
+            </w:r>
+            <w:r>
+              <w:rPr>
+                <w:noProof/>
+                <w:webHidden/>
+              </w:rPr>
+            </w:r>
+            <w:r>
+              <w:rPr>
+                <w:noProof/>
+                <w:webHidden/>
+              </w:rPr>
+              <w:fldChar w:fldCharType="separate"/>
+            </w:r>
+            <w:r>
+              <w:rPr>
+                <w:noProof/>
+                <w:webHidden/>
+              </w:rPr>
+              <w:t>9</w:t>
+            </w:r>
+            <w:r>
+              <w:rPr>
+                <w:noProof/>
+                <w:webHidden/>
+              </w:rPr>
+              <w:fldChar w:fldCharType="end"/>
+            </w:r>
+          </w:hyperlink>
+        </w:p>
+        <w:p>
+          <w:pPr>
+            <w:pStyle w:val="TDC2"/>
+            <w:tabs>
+              <w:tab w:val="right" w:leader="dot" w:pos="9350"/>
+            </w:tabs>
+            <w:rPr>
+              <w:rFonts w:asciiTheme="minorHAnsi" w:eastAsiaTheme="minorEastAsia" w:hAnsiTheme="minorHAnsi"/>
+              <w:noProof/>
+              <w:szCs w:val="24"/>
+              <w:lang w:eastAsia="es-CO"/>
+            </w:rPr>
+          </w:pPr>
+          <w:hyperlink w:anchor="_Toc235725874" w:history="1">
+            <w:r>
+              <w:rPr>
+                <w:rStyle w:val="Hipervnculo"/>
+                <w:noProof/>
+              </w:rPr>
+              <w:t>¿ que técnica fue la mas efectiva</w:t>
+            </w:r>
+            <w:r>
+              <w:rPr>
+                <w:noProof/>
+                <w:webHidden/>
+              </w:rPr>
+              <w:tab/>
+            </w:r>
+            <w:r>
+              <w:rPr>
+                <w:noProof/>
+                <w:webHidden/>
+              </w:rPr>
+              <w:fldChar w:fldCharType="begin"/>
+            </w:r>
+            <w:r>
+              <w:rPr>
+                <w:noProof/>
+                <w:webHidden/>
+              </w:rPr>
+              <w:instrText xml:space="preserve"> PAGEREF _Toc235725874 \h </w:instrText>
+            </w:r>
+            <w:r>
+              <w:rPr>
+                <w:noProof/>
+                <w:webHidden/>
+              </w:rPr>
+            </w:r>
+            <w:r>
+              <w:rPr>
+                <w:noProof/>
+                <w:webHidden/>
+              </w:rPr>
+              <w:fldChar w:fldCharType="separate"/>
+            </w:r>
+            <w:r>
+              <w:rPr>
+                <w:noProof/>
+                <w:webHidden/>
+              </w:rPr>
+              <w:t>9</w:t>
+            </w:r>
+            <w:r>
+              <w:rPr>
+                <w:noProof/>
+                <w:webHidden/>
+              </w:rPr>
+              <w:fldChar w:fldCharType="end"/>
+            </w:r>
+          </w:hyperlink>
+        </w:p>
+        <w:p>
+          <w:pPr>
+            <w:ind w:firstLine="0"/>
+          </w:pPr>
           <w:r>
             <w:rPr>
               <w:b/>
               <w:bCs/>
               <w:lang w:val="es-ES"/>
             </w:rPr>
+            <w:lastRenderedPageBreak/>
             <w:fldChar w:fldCharType="end"/>
           </w:r>
         </w:p>
       </w:sdtContent>
     </w:sdt>
-    <w:p/>
-    <w:p/>
-    <w:p/>
-    <w:p/>
-    <w:p/>
-    <w:p/>
-    <w:p/>
-    <w:p/>
-    <w:p/>
-    <w:p/>
-    <w:p/>
-    <w:p/>
-    <w:p/>
-    <w:p/>
-    <w:p/>
-    <w:p/>
-    <w:p/>
-    <w:p/>
-    <w:p/>
-    <w:p>
-      <w:pPr>
-        <w:ind w:firstLine="0"/>
-      </w:pPr>
-    </w:p>
     <w:p>
       <w:pPr>
         <w:pStyle w:val="Ttulo1"/>
       </w:pPr>
-      <w:bookmarkStart w:id="0" w:name="_Toc235715669"/>
-      <w:r>
-        <w:lastRenderedPageBreak/>
+      <w:bookmarkStart w:id="0" w:name="_Toc235725844"/>
+      <w:r>
         <w:t>Introducción</w:t>
       </w:r>
       <w:bookmarkEnd w:id="0"/>
@@ -700,7 +2418,7 @@
       <w:pPr>
         <w:pStyle w:val="Ttulo1"/>
       </w:pPr>
-      <w:bookmarkStart w:id="1" w:name="_Toc235715670"/>
+      <w:bookmarkStart w:id="1" w:name="_Toc235725845"/>
       <w:r>
         <w:t>Descripción Del Software</w:t>
       </w:r>
@@ -713,7 +2431,7 @@
       <w:pPr>
         <w:pStyle w:val="Ttulo2"/>
       </w:pPr>
-      <w:bookmarkStart w:id="2" w:name="_Toc235715671"/>
+      <w:bookmarkStart w:id="2" w:name="_Toc235725846"/>
       <w:r>
         <w:t>¿Qué es LibreOffice?</w:t>
       </w:r>
@@ -730,13 +2448,8 @@
       </w:r>
     </w:p>
     <w:p>
-      <w:proofErr w:type="spellStart"/>
-      <w:r>
-        <w:t>Writer</w:t>
-      </w:r>
-      <w:proofErr w:type="spellEnd"/>
-      <w:r>
-        <w:t xml:space="preserve"> </w:t>
+      <w:r>
+        <w:t xml:space="preserve">Writer </w:t>
       </w:r>
     </w:p>
     <w:p>
@@ -745,23 +2458,13 @@
       </w:r>
     </w:p>
     <w:p>
-      <w:proofErr w:type="spellStart"/>
-      <w:r>
-        <w:t>Impress</w:t>
-      </w:r>
-      <w:proofErr w:type="spellEnd"/>
-      <w:r>
-        <w:t xml:space="preserve"> </w:t>
-      </w:r>
-    </w:p>
-    <w:p>
-      <w:proofErr w:type="spellStart"/>
-      <w:r>
-        <w:t>Draw</w:t>
-      </w:r>
-      <w:proofErr w:type="spellEnd"/>
-      <w:r>
-        <w:t xml:space="preserve"> </w:t>
+      <w:r>
+        <w:t xml:space="preserve">Impress </w:t>
+      </w:r>
+    </w:p>
+    <w:p>
+      <w:r>
+        <w:t xml:space="preserve">Draw </w:t>
       </w:r>
     </w:p>
     <w:p>
@@ -770,20 +2473,15 @@
       </w:r>
     </w:p>
     <w:p>
-      <w:proofErr w:type="spellStart"/>
-      <w:r>
-        <w:t>Math</w:t>
-      </w:r>
-      <w:proofErr w:type="spellEnd"/>
-      <w:r>
-        <w:t xml:space="preserve"> </w:t>
+      <w:r>
+        <w:t xml:space="preserve">Math </w:t>
       </w:r>
     </w:p>
     <w:p>
       <w:pPr>
         <w:pStyle w:val="Ttulo2"/>
       </w:pPr>
-      <w:bookmarkStart w:id="3" w:name="_Toc235715672"/>
+      <w:bookmarkStart w:id="3" w:name="_Toc235725847"/>
       <w:r>
         <w:t>Características:</w:t>
       </w:r>
@@ -844,7 +2542,7 @@
         <w:pStyle w:val="Ttulo1"/>
         <w:jc w:val="left"/>
       </w:pPr>
-      <w:bookmarkStart w:id="4" w:name="_Toc235715673"/>
+      <w:bookmarkStart w:id="4" w:name="_Toc235725848"/>
       <w:r>
         <w:lastRenderedPageBreak/>
         <w:t>Tabla 1</w:t>
@@ -855,7 +2553,7 @@
       <w:pPr>
         <w:pStyle w:val="Ttulo2"/>
       </w:pPr>
-      <w:bookmarkStart w:id="5" w:name="_Toc235715674"/>
+      <w:bookmarkStart w:id="5" w:name="_Toc235725849"/>
       <w:r>
         <w:t>Requerimientos Del Sistema</w:t>
       </w:r>
@@ -951,13 +2649,8 @@
           </w:tcPr>
           <w:p>
             <w:r>
-              <w:t xml:space="preserve">Memoria </w:t>
-            </w:r>
-            <w:proofErr w:type="spellStart"/>
-            <w:r>
-              <w:t>ram</w:t>
-            </w:r>
-            <w:proofErr w:type="spellEnd"/>
+              <w:t>Memoria ram</w:t>
+            </w:r>
           </w:p>
         </w:tc>
         <w:tc>
@@ -1179,17 +2872,21 @@
       <w:pPr>
         <w:pStyle w:val="Ttulo1"/>
       </w:pPr>
+      <w:bookmarkStart w:id="6" w:name="_Toc235725850"/>
       <w:r>
         <w:t>Instalación</w:t>
       </w:r>
-    </w:p>
-    <w:p>
+      <w:bookmarkEnd w:id="6"/>
+    </w:p>
+    <w:p>
+      <w:bookmarkStart w:id="7" w:name="_Toc235725851"/>
       <w:r>
         <w:rPr>
           <w:rStyle w:val="Ttulo2Car"/>
         </w:rPr>
         <w:t>Paso 1:</w:t>
       </w:r>
+      <w:bookmarkEnd w:id="7"/>
       <w:r>
         <w:t xml:space="preserve"> entrar a la pagina oficial de libre of</w:t>
       </w:r>
@@ -1268,12 +2965,14 @@
       <w:pPr>
         <w:pStyle w:val="Sinespaciado"/>
       </w:pPr>
+      <w:bookmarkStart w:id="8" w:name="_Toc235725852"/>
       <w:r>
         <w:rPr>
           <w:rStyle w:val="Ttulo2Car"/>
         </w:rPr>
         <w:t>Paso 2:</w:t>
       </w:r>
+      <w:bookmarkEnd w:id="8"/>
       <w:r>
         <w:t xml:space="preserve"> </w:t>
       </w:r>
@@ -1281,29 +2980,13 @@
         <w:t xml:space="preserve">seleccionaremos </w:t>
       </w:r>
       <w:r>
-        <w:t xml:space="preserve">el de Windows 64 bits </w:t>
-      </w:r>
-      <w:proofErr w:type="gramStart"/>
-      <w:r>
-        <w:t>( el</w:t>
-      </w:r>
-      <w:proofErr w:type="gramEnd"/>
-      <w:r>
-        <w:t xml:space="preserve"> de </w:t>
+        <w:t xml:space="preserve">el de Windows 64 bits ( el de </w:t>
       </w:r>
       <w:r>
         <w:t>ARM</w:t>
       </w:r>
       <w:r>
-        <w:t xml:space="preserve"> es para pc </w:t>
-      </w:r>
-      <w:proofErr w:type="spellStart"/>
-      <w:r>
-        <w:t>mas</w:t>
-      </w:r>
-      <w:proofErr w:type="spellEnd"/>
-      <w:r>
-        <w:t xml:space="preserve"> potentes)</w:t>
+        <w:t xml:space="preserve"> es para pc mas potentes)</w:t>
       </w:r>
     </w:p>
     <w:p>
@@ -1374,6 +3057,7 @@
           <w:szCs w:val="24"/>
         </w:rPr>
       </w:pPr>
+      <w:bookmarkStart w:id="9" w:name="_Toc235725853"/>
       <w:r>
         <w:rPr>
           <w:rStyle w:val="Ttulo2Car"/>
@@ -1386,6 +3070,7 @@
         </w:rPr>
         <w:t>:</w:t>
       </w:r>
+      <w:bookmarkEnd w:id="9"/>
       <w:r>
         <w:t xml:space="preserve"> </w:t>
       </w:r>
@@ -1393,21 +3078,7 @@
         <w:rPr>
           <w:szCs w:val="24"/>
         </w:rPr>
-        <w:t xml:space="preserve">abrimos el </w:t>
-      </w:r>
-      <w:proofErr w:type="spellStart"/>
-      <w:r>
-        <w:rPr>
-          <w:szCs w:val="24"/>
-        </w:rPr>
-        <w:t>launcher</w:t>
-      </w:r>
-      <w:proofErr w:type="spellEnd"/>
-      <w:r>
-        <w:rPr>
-          <w:szCs w:val="24"/>
-        </w:rPr>
-        <w:t xml:space="preserve"> de instalación desde descargas</w:t>
+        <w:t>abrimos el launcher de instalación desde descargas</w:t>
       </w:r>
       <w:r>
         <w:rPr>
@@ -1557,21 +3228,25 @@
       <w:pPr>
         <w:pStyle w:val="Ttulo1"/>
       </w:pPr>
+      <w:bookmarkStart w:id="10" w:name="_Toc235725854"/>
       <w:r>
         <w:lastRenderedPageBreak/>
         <w:t>Configuración</w:t>
       </w:r>
+      <w:bookmarkEnd w:id="10"/>
     </w:p>
     <w:p>
       <w:pPr>
         <w:pStyle w:val="Sinespaciado"/>
       </w:pPr>
+      <w:bookmarkStart w:id="11" w:name="_Toc235725855"/>
       <w:r>
         <w:rPr>
           <w:rStyle w:val="Ttulo2Car"/>
         </w:rPr>
         <w:t>Paso 1:</w:t>
       </w:r>
+      <w:bookmarkEnd w:id="11"/>
       <w:r>
         <w:t xml:space="preserve">  </w:t>
       </w:r>
@@ -1593,7 +3268,7 @@
           <w:noProof/>
         </w:rPr>
         <w:drawing>
-          <wp:inline distT="0" distB="0" distL="0" distR="0" wp14:anchorId="5B256225" wp14:editId="1542B87C">
+          <wp:inline distT="0" distB="0" distL="0" distR="0" wp14:anchorId="5B256225" wp14:editId="7068D938">
             <wp:extent cx="5438775" cy="2628900"/>
             <wp:effectExtent l="0" t="0" r="9525" b="0"/>
             <wp:docPr id="6" name="Imagen 6"/>
@@ -1644,12 +3319,14 @@
       <w:pPr>
         <w:pStyle w:val="Sinespaciado"/>
       </w:pPr>
+      <w:bookmarkStart w:id="12" w:name="_Toc235725856"/>
       <w:r>
         <w:rPr>
           <w:rStyle w:val="Ttulo2Car"/>
         </w:rPr>
         <w:t>Paso 2:</w:t>
       </w:r>
+      <w:bookmarkEnd w:id="12"/>
       <w:r>
         <w:t xml:space="preserve"> </w:t>
       </w:r>
@@ -1678,7 +3355,7 @@
           <w:noProof/>
         </w:rPr>
         <w:drawing>
-          <wp:inline distT="0" distB="0" distL="0" distR="0" wp14:anchorId="246B4727" wp14:editId="2471B1FE">
+          <wp:inline distT="0" distB="0" distL="0" distR="0" wp14:anchorId="246B4727" wp14:editId="60246CA5">
             <wp:extent cx="5438775" cy="2362200"/>
             <wp:effectExtent l="0" t="0" r="9525" b="0"/>
             <wp:docPr id="7" name="Imagen 7"/>
@@ -1729,12 +3406,14 @@
       <w:pPr>
         <w:pStyle w:val="Sinespaciado"/>
       </w:pPr>
+      <w:bookmarkStart w:id="13" w:name="_Toc235725857"/>
       <w:r>
         <w:rPr>
           <w:rStyle w:val="Ttulo2Car"/>
         </w:rPr>
         <w:t>Paso 3:</w:t>
       </w:r>
+      <w:bookmarkEnd w:id="13"/>
       <w:r>
         <w:t xml:space="preserve"> </w:t>
       </w:r>
@@ -1800,10 +3479,12 @@
       <w:pPr>
         <w:pStyle w:val="Ttulo1"/>
       </w:pPr>
+      <w:bookmarkStart w:id="14" w:name="_Toc235725858"/>
       <w:r>
         <w:lastRenderedPageBreak/>
         <w:t>Verificación</w:t>
       </w:r>
+      <w:bookmarkEnd w:id="14"/>
     </w:p>
     <w:p>
       <w:r>
@@ -1819,13 +3500,8 @@
       </w:r>
     </w:p>
     <w:p>
-      <w:proofErr w:type="spellStart"/>
-      <w:r>
-        <w:t>Writer</w:t>
-      </w:r>
-      <w:proofErr w:type="spellEnd"/>
-      <w:r>
-        <w:t xml:space="preserve"> abre correctamente</w:t>
+      <w:r>
+        <w:t>Writer abre correctamente</w:t>
       </w:r>
     </w:p>
     <w:p>
@@ -1843,28 +3519,34 @@
       <w:pPr>
         <w:pStyle w:val="Ttulo1"/>
       </w:pPr>
+      <w:bookmarkStart w:id="15" w:name="_Toc235725859"/>
       <w:r>
         <w:t>Anexos</w:t>
       </w:r>
+      <w:bookmarkEnd w:id="15"/>
     </w:p>
     <w:p>
       <w:pPr>
         <w:pStyle w:val="Ttulo2"/>
       </w:pPr>
+      <w:bookmarkStart w:id="16" w:name="_Toc235725860"/>
       <w:r>
         <w:t>Tabla 2</w:t>
       </w:r>
+      <w:bookmarkEnd w:id="16"/>
     </w:p>
     <w:p>
       <w:pPr>
         <w:pStyle w:val="Ttulo2"/>
       </w:pPr>
+      <w:bookmarkStart w:id="17" w:name="_Toc235725861"/>
       <w:r>
         <w:t>G</w:t>
       </w:r>
       <w:r>
         <w:t>losario</w:t>
       </w:r>
+      <w:bookmarkEnd w:id="17"/>
     </w:p>
     <w:tbl>
       <w:tblPr>
@@ -1964,15 +3646,7 @@
               <w:ind w:firstLine="0"/>
             </w:pPr>
             <w:r>
-              <w:t xml:space="preserve">Lugar donde </w:t>
-            </w:r>
-            <w:proofErr w:type="spellStart"/>
-            <w:r>
-              <w:t>git</w:t>
-            </w:r>
-            <w:proofErr w:type="spellEnd"/>
-            <w:r>
-              <w:t xml:space="preserve"> almacena el historial del proyecto</w:t>
+              <w:t>Lugar donde git almacena el historial del proyecto</w:t>
             </w:r>
             <w:r>
               <w:t>.</w:t>
@@ -1989,11 +3663,9 @@
             <w:pPr>
               <w:ind w:firstLine="0"/>
             </w:pPr>
-            <w:proofErr w:type="spellStart"/>
             <w:r>
               <w:t>commit</w:t>
             </w:r>
-            <w:proofErr w:type="spellEnd"/>
           </w:p>
         </w:tc>
         <w:tc>
@@ -2047,22 +3719,615 @@
       <w:pPr>
         <w:pStyle w:val="Ttulo1"/>
       </w:pPr>
+      <w:bookmarkStart w:id="18" w:name="_Toc235725862"/>
       <w:r>
         <w:t>Rol 1</w:t>
       </w:r>
+      <w:bookmarkEnd w:id="18"/>
     </w:p>
     <w:p>
       <w:pPr>
         <w:pStyle w:val="Ttulo2"/>
       </w:pPr>
-      <w:r>
-        <w:t xml:space="preserve">Redactor </w:t>
-      </w:r>
-    </w:p>
+      <w:bookmarkStart w:id="19" w:name="_Toc235725863"/>
+      <w:r>
+        <w:t>Redactor</w:t>
+      </w:r>
+      <w:bookmarkEnd w:id="19"/>
+      <w:r>
+        <w:t xml:space="preserve"> </w:t>
+      </w:r>
+    </w:p>
+    <w:p/>
+    <w:p>
+      <w:r>
+        <w:drawing>
+          <wp:inline distT="0" distB="0" distL="0" distR="0" wp14:anchorId="61B91059" wp14:editId="5613F576">
+            <wp:extent cx="5804535" cy="1914525"/>
+            <wp:effectExtent l="0" t="0" r="5715" b="9525"/>
+            <wp:docPr id="1" name="Imagen 1"/>
+            <wp:cNvGraphicFramePr>
+              <a:graphicFrameLocks xmlns:a="http://schemas.openxmlformats.org/drawingml/2006/main" noChangeAspect="1"/>
+            </wp:cNvGraphicFramePr>
+            <a:graphic xmlns:a="http://schemas.openxmlformats.org/drawingml/2006/main">
+              <a:graphicData uri="http://schemas.openxmlformats.org/drawingml/2006/picture">
+                <pic:pic xmlns:pic="http://schemas.openxmlformats.org/drawingml/2006/picture">
+                  <pic:nvPicPr>
+                    <pic:cNvPr id="1" name=""/>
+                    <pic:cNvPicPr/>
+                  </pic:nvPicPr>
+                  <pic:blipFill>
+                    <a:blip r:embed="rId15"/>
+                    <a:stretch>
+                      <a:fillRect/>
+                    </a:stretch>
+                  </pic:blipFill>
+                  <pic:spPr>
+                    <a:xfrm>
+                      <a:off x="0" y="0"/>
+                      <a:ext cx="5808256" cy="1915752"/>
+                    </a:xfrm>
+                    <a:prstGeom prst="rect">
+                      <a:avLst/>
+                    </a:prstGeom>
+                  </pic:spPr>
+                </pic:pic>
+              </a:graphicData>
+            </a:graphic>
+          </wp:inline>
+        </w:drawing>
+      </w:r>
+    </w:p>
+    <w:p/>
+    <w:p/>
+    <w:p>
+      <w:pPr>
+        <w:pStyle w:val="Ttulo1"/>
+      </w:pPr>
+      <w:bookmarkStart w:id="20" w:name="_Toc235725864"/>
+      <w:r>
+        <w:lastRenderedPageBreak/>
+        <w:t>Rol 2</w:t>
+      </w:r>
+      <w:bookmarkEnd w:id="20"/>
+    </w:p>
+    <w:p>
+      <w:pPr>
+        <w:pStyle w:val="Ttulo2"/>
+      </w:pPr>
+      <w:bookmarkStart w:id="21" w:name="_Toc235725865"/>
+      <w:r>
+        <w:t>Revisor</w:t>
+      </w:r>
+      <w:bookmarkEnd w:id="21"/>
+    </w:p>
+    <w:p>
+      <w:r>
+        <w:rPr>
+          <w:noProof/>
+        </w:rPr>
+        <w:drawing>
+          <wp:inline distT="0" distB="0" distL="0" distR="0" wp14:anchorId="490B6DF4" wp14:editId="09708FF0">
+            <wp:extent cx="5943600" cy="1917700"/>
+            <wp:effectExtent l="0" t="0" r="0" b="6350"/>
+            <wp:docPr id="9" name="Imagen 9"/>
+            <wp:cNvGraphicFramePr>
+              <a:graphicFrameLocks xmlns:a="http://schemas.openxmlformats.org/drawingml/2006/main" noChangeAspect="1"/>
+            </wp:cNvGraphicFramePr>
+            <a:graphic xmlns:a="http://schemas.openxmlformats.org/drawingml/2006/main">
+              <a:graphicData uri="http://schemas.openxmlformats.org/drawingml/2006/picture">
+                <pic:pic xmlns:pic="http://schemas.openxmlformats.org/drawingml/2006/picture">
+                  <pic:nvPicPr>
+                    <pic:cNvPr id="9" name="Imagen 9"/>
+                    <pic:cNvPicPr/>
+                  </pic:nvPicPr>
+                  <pic:blipFill>
+                    <a:blip r:embed="rId16">
+                      <a:extLst>
+                        <a:ext uri="{28A0092B-C50C-407E-A947-70E740481C1C}">
+                          <a14:useLocalDpi xmlns:a14="http://schemas.microsoft.com/office/drawing/2010/main" val="0"/>
+                        </a:ext>
+                      </a:extLst>
+                    </a:blip>
+                    <a:stretch>
+                      <a:fillRect/>
+                    </a:stretch>
+                  </pic:blipFill>
+                  <pic:spPr>
+                    <a:xfrm>
+                      <a:off x="0" y="0"/>
+                      <a:ext cx="5943600" cy="1917700"/>
+                    </a:xfrm>
+                    <a:prstGeom prst="rect">
+                      <a:avLst/>
+                    </a:prstGeom>
+                  </pic:spPr>
+                </pic:pic>
+              </a:graphicData>
+            </a:graphic>
+          </wp:inline>
+        </w:drawing>
+      </w:r>
+    </w:p>
+    <w:p>
+      <w:pPr>
+        <w:pStyle w:val="Ttulo1"/>
+      </w:pPr>
+      <w:bookmarkStart w:id="22" w:name="_Toc235725866"/>
+      <w:r>
+        <w:rPr>
+          <w:noProof/>
+        </w:rPr>
+        <w:drawing>
+          <wp:inline distT="0" distB="0" distL="0" distR="0" wp14:anchorId="6FE9B1F2" wp14:editId="19C7796A">
+            <wp:extent cx="5943600" cy="2114550"/>
+            <wp:effectExtent l="0" t="0" r="0" b="0"/>
+            <wp:docPr id="10" name="Imagen 10"/>
+            <wp:cNvGraphicFramePr>
+              <a:graphicFrameLocks xmlns:a="http://schemas.openxmlformats.org/drawingml/2006/main" noChangeAspect="1"/>
+            </wp:cNvGraphicFramePr>
+            <a:graphic xmlns:a="http://schemas.openxmlformats.org/drawingml/2006/main">
+              <a:graphicData uri="http://schemas.openxmlformats.org/drawingml/2006/picture">
+                <pic:pic xmlns:pic="http://schemas.openxmlformats.org/drawingml/2006/picture">
+                  <pic:nvPicPr>
+                    <pic:cNvPr id="10" name="Imagen 10"/>
+                    <pic:cNvPicPr/>
+                  </pic:nvPicPr>
+                  <pic:blipFill>
+                    <a:blip r:embed="rId17">
+                      <a:extLst>
+                        <a:ext uri="{28A0092B-C50C-407E-A947-70E740481C1C}">
+                          <a14:useLocalDpi xmlns:a14="http://schemas.microsoft.com/office/drawing/2010/main" val="0"/>
+                        </a:ext>
+                      </a:extLst>
+                    </a:blip>
+                    <a:stretch>
+                      <a:fillRect/>
+                    </a:stretch>
+                  </pic:blipFill>
+                  <pic:spPr>
+                    <a:xfrm>
+                      <a:off x="0" y="0"/>
+                      <a:ext cx="5943600" cy="2114550"/>
+                    </a:xfrm>
+                    <a:prstGeom prst="rect">
+                      <a:avLst/>
+                    </a:prstGeom>
+                  </pic:spPr>
+                </pic:pic>
+              </a:graphicData>
+            </a:graphic>
+          </wp:inline>
+        </w:drawing>
+      </w:r>
+      <w:bookmarkEnd w:id="22"/>
+    </w:p>
+    <w:p/>
+    <w:p>
+      <w:pPr>
+        <w:pStyle w:val="Ttulo1"/>
+      </w:pPr>
+      <w:bookmarkStart w:id="23" w:name="_Toc235725867"/>
+      <w:r>
+        <w:t>Rol 3</w:t>
+      </w:r>
+      <w:bookmarkEnd w:id="23"/>
+    </w:p>
+    <w:p>
+      <w:pPr>
+        <w:pStyle w:val="Ttulo2"/>
+      </w:pPr>
+      <w:bookmarkStart w:id="24" w:name="_Toc235725868"/>
+      <w:r>
+        <w:t>Editor</w:t>
+      </w:r>
+      <w:bookmarkEnd w:id="24"/>
+      <w:r>
+        <w:t xml:space="preserve"> </w:t>
+      </w:r>
+    </w:p>
+    <w:p/>
+    <w:p/>
+    <w:p/>
+    <w:p/>
+    <w:p/>
+    <w:p/>
+    <w:p/>
+    <w:p/>
+    <w:p>
+      <w:pPr>
+        <w:pStyle w:val="Ttulo2"/>
+      </w:pPr>
+      <w:bookmarkStart w:id="25" w:name="_Toc235725869"/>
+      <w:r>
+        <w:lastRenderedPageBreak/>
+        <w:t>Tabla 3</w:t>
+      </w:r>
+      <w:bookmarkEnd w:id="25"/>
+    </w:p>
+    <w:p>
+      <w:pPr>
+        <w:pStyle w:val="Ttulo2"/>
+      </w:pPr>
+      <w:bookmarkStart w:id="26" w:name="_Toc235725870"/>
+      <w:r>
+        <w:t>Registro de Versiones</w:t>
+      </w:r>
+      <w:bookmarkEnd w:id="26"/>
+      <w:r>
+        <w:t xml:space="preserve"> </w:t>
+      </w:r>
+    </w:p>
+    <w:tbl>
+      <w:tblPr>
+        <w:tblStyle w:val="tablaestiloapa"/>
+        <w:tblW w:w="0" w:type="auto"/>
+        <w:tblLook w:val="04A0" w:firstRow="1" w:lastRow="0" w:firstColumn="1" w:lastColumn="0" w:noHBand="0" w:noVBand="1"/>
+      </w:tblPr>
+      <w:tblGrid>
+        <w:gridCol w:w="3116"/>
+        <w:gridCol w:w="3117"/>
+        <w:gridCol w:w="3117"/>
+      </w:tblGrid>
+      <w:tr>
+        <w:trPr>
+          <w:cnfStyle w:val="100000000000" w:firstRow="1" w:lastRow="0" w:firstColumn="0" w:lastColumn="0" w:oddVBand="0" w:evenVBand="0" w:oddHBand="0" w:evenHBand="0" w:firstRowFirstColumn="0" w:firstRowLastColumn="0" w:lastRowFirstColumn="0" w:lastRowLastColumn="0"/>
+        </w:trPr>
+        <w:tc>
+          <w:tcPr>
+            <w:tcW w:w="3116" w:type="dxa"/>
+          </w:tcPr>
+          <w:p>
+            <w:r>
+              <w:t xml:space="preserve">Versión </w:t>
+            </w:r>
+          </w:p>
+        </w:tc>
+        <w:tc>
+          <w:tcPr>
+            <w:tcW w:w="3117" w:type="dxa"/>
+          </w:tcPr>
+          <w:p>
+            <w:r>
+              <w:t xml:space="preserve">Descripción </w:t>
+            </w:r>
+          </w:p>
+        </w:tc>
+        <w:tc>
+          <w:tcPr>
+            <w:tcW w:w="3117" w:type="dxa"/>
+          </w:tcPr>
+          <w:p>
+            <w:r>
+              <w:t xml:space="preserve">Evidencia </w:t>
+            </w:r>
+          </w:p>
+        </w:tc>
+      </w:tr>
+      <w:tr>
+        <w:tc>
+          <w:tcPr>
+            <w:tcW w:w="3116" w:type="dxa"/>
+          </w:tcPr>
+          <w:p>
+            <w:r>
+              <w:t>V1</w:t>
+            </w:r>
+          </w:p>
+        </w:tc>
+        <w:tc>
+          <w:tcPr>
+            <w:tcW w:w="3117" w:type="dxa"/>
+          </w:tcPr>
+          <w:p>
+            <w:r>
+              <w:t xml:space="preserve">Primera versión elaborada por el redactor </w:t>
+            </w:r>
+          </w:p>
+        </w:tc>
+        <w:tc>
+          <w:tcPr>
+            <w:tcW w:w="3117" w:type="dxa"/>
+          </w:tcPr>
+          <w:p>
+            <w:r>
+              <w:t xml:space="preserve">Commit 1 </w:t>
+            </w:r>
+          </w:p>
+        </w:tc>
+      </w:tr>
+      <w:tr>
+        <w:tc>
+          <w:tcPr>
+            <w:tcW w:w="3116" w:type="dxa"/>
+          </w:tcPr>
+          <w:p>
+            <w:r>
+              <w:t xml:space="preserve">V2 </w:t>
+            </w:r>
+          </w:p>
+        </w:tc>
+        <w:tc>
+          <w:tcPr>
+            <w:tcW w:w="3117" w:type="dxa"/>
+          </w:tcPr>
+          <w:p>
+            <w:r>
+              <w:t>Ajustes realizados después de la revisión</w:t>
+            </w:r>
+          </w:p>
+        </w:tc>
+        <w:tc>
+          <w:tcPr>
+            <w:tcW w:w="3117" w:type="dxa"/>
+          </w:tcPr>
+          <w:p>
+            <w:r>
+              <w:t>Commit 2</w:t>
+            </w:r>
+          </w:p>
+        </w:tc>
+      </w:tr>
+      <w:tr>
+        <w:tc>
+          <w:tcPr>
+            <w:tcW w:w="3116" w:type="dxa"/>
+          </w:tcPr>
+          <w:p>
+            <w:r>
+              <w:t>final</w:t>
+            </w:r>
+          </w:p>
+        </w:tc>
+        <w:tc>
+          <w:tcPr>
+            <w:tcW w:w="3117" w:type="dxa"/>
+          </w:tcPr>
+          <w:p>
+            <w:r>
+              <w:t>Documento corregido y aprovado</w:t>
+            </w:r>
+          </w:p>
+        </w:tc>
+        <w:tc>
+          <w:tcPr>
+            <w:tcW w:w="3117" w:type="dxa"/>
+          </w:tcPr>
+          <w:p>
+            <w:r>
+              <w:t>Commit 3</w:t>
+            </w:r>
+          </w:p>
+        </w:tc>
+      </w:tr>
+    </w:tbl>
+    <w:p/>
+    <w:p>
+      <w:pPr>
+        <w:pStyle w:val="Ttulo2"/>
+      </w:pPr>
+      <w:bookmarkStart w:id="27" w:name="_Toc235725871"/>
+      <w:r>
+        <w:t>Tabla 4</w:t>
+      </w:r>
+      <w:bookmarkEnd w:id="27"/>
+      <w:r>
+        <w:t xml:space="preserve"> </w:t>
+      </w:r>
+    </w:p>
+    <w:p>
+      <w:pPr>
+        <w:pStyle w:val="Ttulo2"/>
+      </w:pPr>
+      <w:bookmarkStart w:id="28" w:name="_Toc235725872"/>
+      <w:r>
+        <w:t>Resumen de Cambios</w:t>
+      </w:r>
+      <w:bookmarkEnd w:id="28"/>
+      <w:r>
+        <w:t xml:space="preserve"> </w:t>
+      </w:r>
+    </w:p>
+    <w:tbl>
+      <w:tblPr>
+        <w:tblStyle w:val="tablaestiloapa"/>
+        <w:tblW w:w="0" w:type="auto"/>
+        <w:tblLook w:val="04A0" w:firstRow="1" w:lastRow="0" w:firstColumn="1" w:lastColumn="0" w:noHBand="0" w:noVBand="1"/>
+      </w:tblPr>
+      <w:tblGrid>
+        <w:gridCol w:w="4675"/>
+        <w:gridCol w:w="4675"/>
+      </w:tblGrid>
+      <w:tr>
+        <w:trPr>
+          <w:cnfStyle w:val="100000000000" w:firstRow="1" w:lastRow="0" w:firstColumn="0" w:lastColumn="0" w:oddVBand="0" w:evenVBand="0" w:oddHBand="0" w:evenHBand="0" w:firstRowFirstColumn="0" w:firstRowLastColumn="0" w:lastRowFirstColumn="0" w:lastRowLastColumn="0"/>
+        </w:trPr>
+        <w:tc>
+          <w:tcPr>
+            <w:tcW w:w="4675" w:type="dxa"/>
+          </w:tcPr>
+          <w:p>
+            <w:r>
+              <w:t>cambio</w:t>
+            </w:r>
+          </w:p>
+        </w:tc>
+        <w:tc>
+          <w:tcPr>
+            <w:tcW w:w="4675" w:type="dxa"/>
+          </w:tcPr>
+          <w:p>
+            <w:r>
+              <w:t>motivo</w:t>
+            </w:r>
+          </w:p>
+        </w:tc>
+      </w:tr>
+      <w:tr>
+        <w:tc>
+          <w:tcPr>
+            <w:tcW w:w="4675" w:type="dxa"/>
+          </w:tcPr>
+          <w:p>
+            <w:r>
+              <w:t>Se agrego un glosario</w:t>
+            </w:r>
+          </w:p>
+        </w:tc>
+        <w:tc>
+          <w:tcPr>
+            <w:tcW w:w="4675" w:type="dxa"/>
+          </w:tcPr>
+          <w:p>
+            <w:r>
+              <w:t xml:space="preserve">Mejor comprensión </w:t>
+            </w:r>
+          </w:p>
+        </w:tc>
+      </w:tr>
+      <w:tr>
+        <w:tc>
+          <w:tcPr>
+            <w:tcW w:w="4675" w:type="dxa"/>
+          </w:tcPr>
+          <w:p>
+            <w:r>
+              <w:t xml:space="preserve">Se corrigió ortografía </w:t>
+            </w:r>
+          </w:p>
+        </w:tc>
+        <w:tc>
+          <w:tcPr>
+            <w:tcW w:w="4675" w:type="dxa"/>
+          </w:tcPr>
+          <w:p>
+            <w:r>
+              <w:t xml:space="preserve">Mejor presentación </w:t>
+            </w:r>
+          </w:p>
+        </w:tc>
+      </w:tr>
+      <w:tr>
+        <w:tc>
+          <w:tcPr>
+            <w:tcW w:w="4675" w:type="dxa"/>
+          </w:tcPr>
+          <w:p>
+            <w:r>
+              <w:t xml:space="preserve">Se ampliaron los requisitos </w:t>
+            </w:r>
+          </w:p>
+        </w:tc>
+        <w:tc>
+          <w:tcPr>
+            <w:tcW w:w="4675" w:type="dxa"/>
+          </w:tcPr>
+          <w:p>
+            <w:r>
+              <w:t xml:space="preserve">Mayor claridad </w:t>
+            </w:r>
+          </w:p>
+        </w:tc>
+      </w:tr>
+      <w:tr>
+        <w:tc>
+          <w:tcPr>
+            <w:tcW w:w="4675" w:type="dxa"/>
+          </w:tcPr>
+          <w:p>
+            <w:r>
+              <w:t>Se mejoro la instalación</w:t>
+            </w:r>
+          </w:p>
+        </w:tc>
+        <w:tc>
+          <w:tcPr>
+            <w:tcW w:w="4675" w:type="dxa"/>
+          </w:tcPr>
+          <w:p>
+            <w:r>
+              <w:t xml:space="preserve">Mas detalle </w:t>
+            </w:r>
+          </w:p>
+        </w:tc>
+      </w:tr>
+      <w:tr>
+        <w:tc>
+          <w:tcPr>
+            <w:tcW w:w="4675" w:type="dxa"/>
+          </w:tcPr>
+          <w:p>
+            <w:r>
+              <w:t>Se reorganizaron los títulos</w:t>
+            </w:r>
+          </w:p>
+        </w:tc>
+        <w:tc>
+          <w:tcPr>
+            <w:tcW w:w="4675" w:type="dxa"/>
+          </w:tcPr>
+          <w:p>
+            <w:r>
+              <w:t xml:space="preserve">Mejor estructura </w:t>
+            </w:r>
+          </w:p>
+        </w:tc>
+      </w:tr>
+    </w:tbl>
+    <w:p/>
+    <w:p>
+      <w:pPr>
+        <w:rPr>
+          <w:bCs/>
+        </w:rPr>
+      </w:pPr>
+    </w:p>
+    <w:p>
+      <w:pPr>
+        <w:pStyle w:val="Ttulo1"/>
+      </w:pPr>
+      <w:bookmarkStart w:id="29" w:name="_Toc235725873"/>
+      <w:r>
+        <w:t>Reflexión</w:t>
+      </w:r>
+      <w:bookmarkEnd w:id="29"/>
+      <w:r>
+        <w:t xml:space="preserve"> </w:t>
+      </w:r>
+    </w:p>
+    <w:p>
+      <w:pPr>
+        <w:pStyle w:val="Ttulo2"/>
+        <w:rPr>
+          <w:lang w:val="es-MX"/>
+        </w:rPr>
+      </w:pPr>
+      <w:bookmarkStart w:id="30" w:name="_Toc235725874"/>
+      <w:r>
+        <w:t>¿ que técnica fue la mas efectiva</w:t>
+      </w:r>
+      <w:bookmarkEnd w:id="30"/>
+      <w:r>
+        <w:t xml:space="preserve"> </w:t>
+      </w:r>
+    </w:p>
+    <w:p>
+      <w:pPr>
+        <w:rPr>
+          <w:lang w:val="es-MX"/>
+        </w:rPr>
+      </w:pPr>
+      <w:r>
+        <w:t>La técnica de colaboración más efectiva fue el control de versiones mediante GitHub. Gracias a los commits fue posible registrar cada cambio realizado durante la elaboración del documento, facilitando el seguimiento del progreso y la recuperación de versiones anteriores. Los Issues permitieron simular el proceso de revisión técnica mediante observaciones puntuales, mientras que la etapa de edición aseguró que todas las mejoras fueran incorporadas antes de generar la versión final. En conjunto, estas herramientas mejoraron la organización, la trazabilidad y la calidad del documento.</w:t>
+      </w:r>
+    </w:p>
+    <w:p/>
+    <w:p/>
+    <w:p/>
     <w:p/>
     <w:p/>
     <w:sectPr>
-      <w:headerReference w:type="default" r:id="rId15"/>
+      <w:headerReference w:type="default" r:id="rId18"/>
       <w:pgSz w:w="12240" w:h="15840"/>
       <w:pgMar w:top="1440" w:right="1440" w:bottom="1440" w:left="1440" w:header="709" w:footer="709" w:gutter="0"/>
       <w:cols w:space="708"/>
@@ -3276,6 +5541,7 @@
       <w:numPr>
         <w:ilvl w:val="1"/>
       </w:numPr>
+      <w:ind w:firstLine="720"/>
     </w:pPr>
     <w:rPr>
       <w:rFonts w:eastAsiaTheme="majorEastAsia" w:cstheme="majorBidi"/>

</xml_diff>